<commit_message>
Record public OSF prereg URL and add the bioRxiv submission PDF.
The registration is live at osf.io/c8kpx. Independent-researcher preprint packet is ready to upload; confirmatory numbers are unchanged.

Co-authored-by: Cursor <cursoragent@cursor.com>
</commit_message>
<xml_diff>
--- a/docs/manuscript.docx
+++ b/docs/manuscript.docx
@@ -2,7 +2,7 @@
 <file path=word/document.xml><?xml version="1.0" encoding="utf-8"?>
 <w:document xmlns:w="http://schemas.openxmlformats.org/wordprocessingml/2006/main" xmlns:m="http://schemas.openxmlformats.org/officeDocument/2006/math" xmlns:r="http://schemas.openxmlformats.org/officeDocument/2006/relationships" xmlns:o="urn:schemas-microsoft-com:office:office" xmlns:v="urn:schemas-microsoft-com:vml" xmlns:w10="urn:schemas-microsoft-com:office:word" xmlns:a="http://schemas.openxmlformats.org/drawingml/2006/main" xmlns:pic="http://schemas.openxmlformats.org/drawingml/2006/picture" xmlns:wp="http://schemas.openxmlformats.org/drawingml/2006/wordprocessingDrawing">
   <w:body>
-    <w:bookmarkStart w:id="41" w:name="X887cbbf882fef937dda06941d4adf4434e3015c"/>
+    <w:bookmarkStart w:id="43" w:name="X887cbbf882fef937dda06941d4adf4434e3015c"/>
     <w:p>
       <w:pPr>
         <w:pStyle w:val="Heading1"/>
@@ -22,10 +22,10 @@
         <w:br/>
       </w:r>
       <w:r>
-        <w:t xml:space="preserve">Correspondence: chadauld@gmail.com</w:t>
-      </w:r>
-      <w:r>
-        <w:br/>
+        <w:t xml:space="preserve">Correspondence: chadauld+osf@gmail.com</w:t>
+      </w:r>
+      <w:r>
+        <w:t xml:space="preserve"> </w:t>
       </w:r>
       <w:r>
         <w:t xml:space="preserve">Repository: https://github.com/cauld/scendo</w:t>
@@ -118,10 +118,38 @@
         <w:t xml:space="preserve">2a74270</w:t>
       </w:r>
       <w:r>
-        <w:t xml:space="preserve">.</w:t>
-      </w:r>
-    </w:p>
-    <w:bookmarkStart w:id="12" w:name="abstract"/>
+        <w:t xml:space="preserve">. OSF prereg:</w:t>
+      </w:r>
+      <w:r>
+        <w:t xml:space="preserve"> </w:t>
+      </w:r>
+      <w:hyperlink r:id="rId12">
+        <w:r>
+          <w:rPr>
+            <w:rStyle w:val="Hyperlink"/>
+          </w:rPr>
+          <w:t xml:space="preserve">osf.io/c8kpx</w:t>
+        </w:r>
+      </w:hyperlink>
+      <w:r>
+        <w:t xml:space="preserve"> </w:t>
+      </w:r>
+      <w:r>
+        <w:t xml:space="preserve">(</w:t>
+      </w:r>
+      <w:hyperlink r:id="rId13">
+        <w:r>
+          <w:rPr>
+            <w:rStyle w:val="Hyperlink"/>
+          </w:rPr>
+          <w:t xml:space="preserve">doi:10.17605/OSF.IO/C8KPX</w:t>
+        </w:r>
+      </w:hyperlink>
+      <w:r>
+        <w:t xml:space="preserve">).</w:t>
+      </w:r>
+    </w:p>
+    <w:bookmarkStart w:id="14" w:name="abstract"/>
     <w:p>
       <w:pPr>
         <w:pStyle w:val="Heading2"/>
@@ -263,8 +291,8 @@
         <w:t xml:space="preserve">associate with atezolizumab response in IMvigor210 after B + TLS + CD8 (Model 1 n=298, ECS OR 1.189, 95% CI 0.551–2.563). Overall survival, unadjusted models, a TMB/PD-L1 robustness fit, and two small melanoma GEO sets do not carry this claim. This is a named-state map with a frozen negative ICI chapter. It is not a test of cannabis therapy and does not show that CB2 is a clinical checkpoint.</w:t>
       </w:r>
     </w:p>
-    <w:bookmarkEnd w:id="12"/>
-    <w:bookmarkStart w:id="13" w:name="introduction"/>
+    <w:bookmarkEnd w:id="14"/>
+    <w:bookmarkStart w:id="15" w:name="introduction"/>
     <w:p>
       <w:pPr>
         <w:pStyle w:val="Heading2"/>
@@ -377,8 +405,8 @@
         <w:t xml:space="preserve">an immune checkpoint in the clinical sense.</w:t>
       </w:r>
     </w:p>
-    <w:bookmarkEnd w:id="13"/>
-    <w:bookmarkStart w:id="28" w:name="results"/>
+    <w:bookmarkEnd w:id="15"/>
+    <w:bookmarkStart w:id="30" w:name="results"/>
     <w:p>
       <w:pPr>
         <w:pStyle w:val="Heading2"/>
@@ -387,7 +415,7 @@
         <w:t xml:space="preserve">Results</w:t>
       </w:r>
     </w:p>
-    <w:bookmarkStart w:id="14" w:name="X4fbe59814a918125e0ddf4f40392723616bbbd1"/>
+    <w:bookmarkStart w:id="16" w:name="X4fbe59814a918125e0ddf4f40392723616bbbd1"/>
     <w:p>
       <w:pPr>
         <w:pStyle w:val="Heading3"/>
@@ -540,8 +568,8 @@
         <w:t xml:space="preserve">is not uniformly dark in every non-B lineage. The map is tables (and heatmaps of those tables). There is no UMAP, Harmony, or scVI atlas in this protocol.</w:t>
       </w:r>
     </w:p>
-    <w:bookmarkEnd w:id="14"/>
-    <w:bookmarkStart w:id="15" w:name="X7236e25cfbc2a229760460deab205e16ddd7a51"/>
+    <w:bookmarkEnd w:id="16"/>
+    <w:bookmarkStart w:id="17" w:name="X7236e25cfbc2a229760460deab205e16ddd7a51"/>
     <w:p>
       <w:pPr>
         <w:pStyle w:val="Heading3"/>
@@ -646,8 +674,8 @@
         <w:t xml:space="preserve">nine-gene score.</w:t>
       </w:r>
     </w:p>
-    <w:bookmarkEnd w:id="15"/>
-    <w:bookmarkStart w:id="22" w:name="expansion-is-pre-specified-not-shopped"/>
+    <w:bookmarkEnd w:id="17"/>
+    <w:bookmarkStart w:id="24" w:name="expansion-is-pre-specified-not-shopped"/>
     <w:p>
       <w:pPr>
         <w:pStyle w:val="Heading3"/>
@@ -726,18 +754,18 @@
           <wp:inline>
             <wp:extent cx="5334000" cy="4318000"/>
             <wp:effectExtent b="0" l="0" r="0" t="0"/>
-            <wp:docPr descr="Mean core-ECS by type and lineage bucket" title="" id="17" name="Picture"/>
+            <wp:docPr descr="Mean core-ECS by type and lineage bucket" title="" id="19" name="Picture"/>
             <a:graphic>
               <a:graphicData uri="http://schemas.openxmlformats.org/drawingml/2006/picture">
                 <pic:pic>
                   <pic:nvPicPr>
-                    <pic:cNvPr descr="diagrams/13-mean-ecs.png" id="18" name="Picture"/>
+                    <pic:cNvPr descr="diagrams/13-mean-ecs.png" id="20" name="Picture"/>
                     <pic:cNvPicPr>
                       <a:picLocks noChangeArrowheads="1" noChangeAspect="1"/>
                     </pic:cNvPicPr>
                   </pic:nvPicPr>
                   <pic:blipFill>
-                    <a:blip r:embed="rId16"/>
+                    <a:blip r:embed="rId18"/>
                     <a:stretch>
                       <a:fillRect/>
                     </a:stretch>
@@ -789,18 +817,18 @@
           <wp:inline>
             <wp:extent cx="5334000" cy="3942521"/>
             <wp:effectExtent b="0" l="0" r="0" t="0"/>
-            <wp:docPr descr="Nine-gene detection in Stromal/other" title="" id="20" name="Picture"/>
+            <wp:docPr descr="Nine-gene detection in Stromal/other" title="" id="22" name="Picture"/>
             <a:graphic>
               <a:graphicData uri="http://schemas.openxmlformats.org/drawingml/2006/picture">
                 <pic:pic>
                   <pic:nvPicPr>
-                    <pic:cNvPr descr="diagrams/13-detection-stromal.png" id="21" name="Picture"/>
+                    <pic:cNvPr descr="diagrams/13-detection-stromal.png" id="23" name="Picture"/>
                     <pic:cNvPicPr>
                       <a:picLocks noChangeArrowheads="1" noChangeAspect="1"/>
                     </pic:cNvPicPr>
                   </pic:nvPicPr>
                   <pic:blipFill>
-                    <a:blip r:embed="rId19"/>
+                    <a:blip r:embed="rId21"/>
                     <a:stretch>
                       <a:fillRect/>
                     </a:stretch>
@@ -835,8 +863,8 @@
         <w:t xml:space="preserve">Nine-gene detection in Stromal/other</w:t>
       </w:r>
     </w:p>
-    <w:bookmarkEnd w:id="22"/>
-    <w:bookmarkStart w:id="26" w:name="X2eebd96ae13d779a96628879887ec010cd256e4"/>
+    <w:bookmarkEnd w:id="24"/>
+    <w:bookmarkStart w:id="28" w:name="X2eebd96ae13d779a96628879887ec010cd256e4"/>
     <w:p>
       <w:pPr>
         <w:pStyle w:val="Heading3"/>
@@ -908,18 +936,18 @@
           <wp:inline>
             <wp:extent cx="5334000" cy="4772526"/>
             <wp:effectExtent b="0" l="0" r="0" t="0"/>
-            <wp:docPr descr="Stromal/other subtype composition" title="" id="24" name="Picture"/>
+            <wp:docPr descr="Stromal/other subtype composition" title="" id="26" name="Picture"/>
             <a:graphic>
               <a:graphicData uri="http://schemas.openxmlformats.org/drawingml/2006/picture">
                 <pic:pic>
                   <pic:nvPicPr>
-                    <pic:cNvPr descr="diagrams/13-stromal-composition.png" id="25" name="Picture"/>
+                    <pic:cNvPr descr="diagrams/13-stromal-composition.png" id="27" name="Picture"/>
                     <pic:cNvPicPr>
                       <a:picLocks noChangeArrowheads="1" noChangeAspect="1"/>
                     </pic:cNvPicPr>
                   </pic:nvPicPr>
                   <pic:blipFill>
-                    <a:blip r:embed="rId23"/>
+                    <a:blip r:embed="rId25"/>
                     <a:stretch>
                       <a:fillRect/>
                     </a:stretch>
@@ -954,8 +982,8 @@
         <w:t xml:space="preserve">Stromal/other subtype composition</w:t>
       </w:r>
     </w:p>
-    <w:bookmarkEnd w:id="26"/>
-    <w:bookmarkStart w:id="27" w:name="Xe27df8b3929740e3e955583e922a7229f13eb44"/>
+    <w:bookmarkEnd w:id="28"/>
+    <w:bookmarkStart w:id="29" w:name="Xe27df8b3929740e3e955583e922a7229f13eb44"/>
     <w:p>
       <w:pPr>
         <w:pStyle w:val="Heading3"/>
@@ -1195,9 +1223,9 @@
         <w:t xml:space="preserve">Unadjusted ECS OR 1.076 (0.568–2.038), Model 2 n=234 ECS OR 1.093 (0.449–2.663), and Cox OS n=348 ECS HR 0.898 (0.623–1.294) are secondary. Two pre-treatment melanoma GEO sets (GSE78220 n=26, ECS OR 0.469, 0.019–11.697; GSE91061 n=49, ECS OR 0.603, 0.066–5.510) are underpowered replication. None of these can carry or rescue the confirmatory claim. Deconvolution was not run. No cutoff was searched.</w:t>
       </w:r>
     </w:p>
-    <w:bookmarkEnd w:id="27"/>
-    <w:bookmarkEnd w:id="28"/>
-    <w:bookmarkStart w:id="29" w:name="discussion"/>
+    <w:bookmarkEnd w:id="29"/>
+    <w:bookmarkEnd w:id="30"/>
+    <w:bookmarkStart w:id="31" w:name="discussion"/>
     <w:p>
       <w:pPr>
         <w:pStyle w:val="Heading2"/>
@@ -1282,8 +1310,8 @@
         <w:t xml:space="preserve">: cell states, a non-B state distinct from B/TLS abundance, and a frozen negative IMvigor210 response test. What it may not say: cannabis as therapy; CB2 as a clinical checkpoint; a practice change during PD-1.</w:t>
       </w:r>
     </w:p>
-    <w:bookmarkEnd w:id="29"/>
-    <w:bookmarkStart w:id="34" w:name="methods"/>
+    <w:bookmarkEnd w:id="31"/>
+    <w:bookmarkStart w:id="36" w:name="methods"/>
     <w:p>
       <w:pPr>
         <w:pStyle w:val="Heading2"/>
@@ -1312,7 +1340,7 @@
       <w:r>
         <w:t xml:space="preserve"> </w:t>
       </w:r>
-      <w:hyperlink r:id="rId30">
+      <w:hyperlink r:id="rId32">
         <w:r>
           <w:rPr>
             <w:rStyle w:val="VerbatimChar"/>
@@ -1341,7 +1369,7 @@
       <w:r>
         <w:t xml:space="preserve"> </w:t>
       </w:r>
-      <w:hyperlink r:id="rId31">
+      <w:hyperlink r:id="rId33">
         <w:r>
           <w:rPr>
             <w:rStyle w:val="VerbatimChar"/>
@@ -1370,7 +1398,7 @@
       <w:r>
         <w:t xml:space="preserve"> </w:t>
       </w:r>
-      <w:hyperlink r:id="rId32">
+      <w:hyperlink r:id="rId34">
         <w:r>
           <w:rPr>
             <w:rStyle w:val="VerbatimChar"/>
@@ -1384,7 +1412,7 @@
       <w:r>
         <w:t xml:space="preserve"> </w:t>
       </w:r>
-      <w:hyperlink r:id="rId33">
+      <w:hyperlink r:id="rId35">
         <w:r>
           <w:rPr>
             <w:rStyle w:val="VerbatimChar"/>
@@ -1405,7 +1433,47 @@
         <w:t xml:space="preserve">research/</w:t>
       </w:r>
       <w:r>
-        <w:t xml:space="preserve">.</w:t>
+        <w:t xml:space="preserve">. Public lock:</w:t>
+      </w:r>
+      <w:r>
+        <w:t xml:space="preserve"> </w:t>
+      </w:r>
+      <w:hyperlink r:id="rId12">
+        <w:r>
+          <w:rPr>
+            <w:rStyle w:val="Hyperlink"/>
+          </w:rPr>
+          <w:t xml:space="preserve">OSF Secondary Data Preregistration</w:t>
+        </w:r>
+        <w:r>
+          <w:rPr>
+            <w:rStyle w:val="Hyperlink"/>
+          </w:rPr>
+          <w:t xml:space="preserve"> </w:t>
+        </w:r>
+        <w:r>
+          <w:rPr>
+            <w:rStyle w:val="VerbatimChar"/>
+          </w:rPr>
+          <w:t xml:space="preserve">c8kpx</w:t>
+        </w:r>
+      </w:hyperlink>
+      <w:r>
+        <w:t xml:space="preserve"> </w:t>
+      </w:r>
+      <w:r>
+        <w:t xml:space="preserve">(</w:t>
+      </w:r>
+      <w:hyperlink r:id="rId13">
+        <w:r>
+          <w:rPr>
+            <w:rStyle w:val="Hyperlink"/>
+          </w:rPr>
+          <w:t xml:space="preserve">doi:10.17605/OSF.IO/C8KPX</w:t>
+        </w:r>
+      </w:hyperlink>
+      <w:r>
+        <w:t xml:space="preserve">).</w:t>
       </w:r>
     </w:p>
     <w:p>
@@ -1639,8 +1707,8 @@
         <w:t xml:space="preserve">Heatmaps are of the confirmatory type × lineage tables and of the display-only stromal composition table. No embedding.</w:t>
       </w:r>
     </w:p>
-    <w:bookmarkEnd w:id="34"/>
-    <w:bookmarkStart w:id="38" w:name="data-and-code"/>
+    <w:bookmarkEnd w:id="36"/>
+    <w:bookmarkStart w:id="40" w:name="data-and-code"/>
     <w:p>
       <w:pPr>
         <w:pStyle w:val="Heading2"/>
@@ -1674,7 +1742,7 @@
       <w:r>
         <w:t xml:space="preserve"> </w:t>
       </w:r>
-      <w:hyperlink r:id="rId35">
+      <w:hyperlink r:id="rId37">
         <w:r>
           <w:rPr>
             <w:rStyle w:val="Hyperlink"/>
@@ -1688,7 +1756,7 @@
       <w:r>
         <w:t xml:space="preserve"> </w:t>
       </w:r>
-      <w:hyperlink r:id="rId36">
+      <w:hyperlink r:id="rId38">
         <w:r>
           <w:rPr>
             <w:rStyle w:val="VerbatimChar"/>
@@ -1697,6 +1765,20 @@
         </w:r>
       </w:hyperlink>
       <w:r>
+        <w:t xml:space="preserve">. Preregistration:</w:t>
+      </w:r>
+      <w:r>
+        <w:t xml:space="preserve"> </w:t>
+      </w:r>
+      <w:hyperlink r:id="rId12">
+        <w:r>
+          <w:rPr>
+            <w:rStyle w:val="Hyperlink"/>
+          </w:rPr>
+          <w:t xml:space="preserve">osf.io/c8kpx</w:t>
+        </w:r>
+      </w:hyperlink>
+      <w:r>
         <w:t xml:space="preserve">.</w:t>
       </w:r>
     </w:p>
@@ -1770,7 +1852,7 @@
       <w:r>
         <w:t xml:space="preserve"> </w:t>
       </w:r>
-      <w:hyperlink r:id="rId37">
+      <w:hyperlink r:id="rId39">
         <w:r>
           <w:rPr>
             <w:rStyle w:val="VerbatimChar"/>
@@ -1782,8 +1864,8 @@
         <w:t xml:space="preserve">.</w:t>
       </w:r>
     </w:p>
-    <w:bookmarkEnd w:id="38"/>
-    <w:bookmarkStart w:id="39" w:name="competing-interests"/>
+    <w:bookmarkEnd w:id="40"/>
+    <w:bookmarkStart w:id="41" w:name="competing-interests"/>
     <w:p>
       <w:pPr>
         <w:pStyle w:val="Heading2"/>
@@ -1800,8 +1882,8 @@
         <w:t xml:space="preserve">The author declares no competing interests. Confirm before a journal or preprint click.</w:t>
       </w:r>
     </w:p>
-    <w:bookmarkEnd w:id="39"/>
-    <w:bookmarkStart w:id="40" w:name="references-datasets"/>
+    <w:bookmarkEnd w:id="41"/>
+    <w:bookmarkStart w:id="42" w:name="references-datasets"/>
     <w:p>
       <w:pPr>
         <w:pStyle w:val="Heading2"/>
@@ -1819,25 +1901,21 @@
         </w:numPr>
       </w:pPr>
       <w:r>
-        <w:t xml:space="preserve">CELLxGENE Census, version</w:t>
-      </w:r>
-      <w:r>
-        <w:t xml:space="preserve"> </w:t>
-      </w:r>
-      <w:r>
-        <w:rPr>
-          <w:rStyle w:val="VerbatimChar"/>
-        </w:rPr>
-        <w:t xml:space="preserve">2025-11-08</w:t>
-      </w:r>
-      <w:r>
-        <w:t xml:space="preserve"> </w:t>
-      </w:r>
-      <w:r>
-        <w:t xml:space="preserve">(CZI).</w:t>
-      </w:r>
-      <w:r>
-        <w:br/>
+        <w:t xml:space="preserve">Auld, C. (2026). SCENDO: single-cell endocannabinoidome states and immune-checkpoint response after B-cell/TLS adjustment. OSF.</w:t>
+      </w:r>
+      <w:r>
+        <w:t xml:space="preserve"> </w:t>
+      </w:r>
+      <w:hyperlink r:id="rId13">
+        <w:r>
+          <w:rPr>
+            <w:rStyle w:val="Hyperlink"/>
+          </w:rPr>
+          <w:t xml:space="preserve">https://doi.org/10.17605/OSF.IO/C8KPX</w:t>
+        </w:r>
+      </w:hyperlink>
+      <w:r>
+        <w:t xml:space="preserve">.</w:t>
       </w:r>
     </w:p>
     <w:p>
@@ -1849,37 +1927,22 @@
         </w:numPr>
       </w:pPr>
       <w:r>
-        <w:t xml:space="preserve">TISCH2</w:t>
-      </w:r>
-      <w:r>
-        <w:t xml:space="preserve"> </w:t>
-      </w:r>
-      <w:r>
-        <w:rPr>
-          <w:rStyle w:val="VerbatimChar"/>
-        </w:rPr>
-        <w:t xml:space="preserve">BLCA_GSE130001</w:t>
-      </w:r>
-      <w:r>
-        <w:t xml:space="preserve"> </w:t>
-      </w:r>
-      <w:r>
-        <w:t xml:space="preserve">cell types with GEO</w:t>
-      </w:r>
-      <w:r>
-        <w:t xml:space="preserve"> </w:t>
-      </w:r>
-      <w:r>
-        <w:rPr>
-          <w:rStyle w:val="VerbatimChar"/>
-        </w:rPr>
-        <w:t xml:space="preserve">GSE130001</w:t>
-      </w:r>
-      <w:r>
-        <w:t xml:space="preserve"> </w:t>
-      </w:r>
-      <w:r>
-        <w:t xml:space="preserve">counts.</w:t>
+        <w:t xml:space="preserve">CELLxGENE Census, version</w:t>
+      </w:r>
+      <w:r>
+        <w:t xml:space="preserve"> </w:t>
+      </w:r>
+      <w:r>
+        <w:rPr>
+          <w:rStyle w:val="VerbatimChar"/>
+        </w:rPr>
+        <w:t xml:space="preserve">2025-11-08</w:t>
+      </w:r>
+      <w:r>
+        <w:t xml:space="preserve"> </w:t>
+      </w:r>
+      <w:r>
+        <w:t xml:space="preserve">(CZI).</w:t>
       </w:r>
       <w:r>
         <w:br/>
@@ -1894,22 +1957,37 @@
         </w:numPr>
       </w:pPr>
       <w:r>
-        <w:t xml:space="preserve">TOIL TCGA</w:t>
-      </w:r>
-      <w:r>
-        <w:t xml:space="preserve"> </w:t>
-      </w:r>
-      <w:r>
-        <w:rPr>
-          <w:rStyle w:val="VerbatimChar"/>
-        </w:rPr>
-        <w:t xml:space="preserve">tcga_RSEM_gene_tpm</w:t>
-      </w:r>
-      <w:r>
-        <w:t xml:space="preserve"> </w:t>
-      </w:r>
-      <w:r>
-        <w:t xml:space="preserve">via Xena.</w:t>
+        <w:t xml:space="preserve">TISCH2</w:t>
+      </w:r>
+      <w:r>
+        <w:t xml:space="preserve"> </w:t>
+      </w:r>
+      <w:r>
+        <w:rPr>
+          <w:rStyle w:val="VerbatimChar"/>
+        </w:rPr>
+        <w:t xml:space="preserve">BLCA_GSE130001</w:t>
+      </w:r>
+      <w:r>
+        <w:t xml:space="preserve"> </w:t>
+      </w:r>
+      <w:r>
+        <w:t xml:space="preserve">cell types with GEO</w:t>
+      </w:r>
+      <w:r>
+        <w:t xml:space="preserve"> </w:t>
+      </w:r>
+      <w:r>
+        <w:rPr>
+          <w:rStyle w:val="VerbatimChar"/>
+        </w:rPr>
+        <w:t xml:space="preserve">GSE130001</w:t>
+      </w:r>
+      <w:r>
+        <w:t xml:space="preserve"> </w:t>
+      </w:r>
+      <w:r>
+        <w:t xml:space="preserve">counts.</w:t>
       </w:r>
       <w:r>
         <w:br/>
@@ -1924,19 +2002,22 @@
         </w:numPr>
       </w:pPr>
       <w:r>
-        <w:t xml:space="preserve">Mariathasan et al., IMvigor210 (</w:t>
-      </w:r>
-      <w:r>
-        <w:rPr>
-          <w:rStyle w:val="VerbatimChar"/>
-        </w:rPr>
-        <w:t xml:space="preserve">IMvigor210CoreBiologies</w:t>
-      </w:r>
-      <w:r>
-        <w:t xml:space="preserve"> </w:t>
-      </w:r>
-      <w:r>
-        <w:t xml:space="preserve">1.0.1).</w:t>
+        <w:t xml:space="preserve">TOIL TCGA</w:t>
+      </w:r>
+      <w:r>
+        <w:t xml:space="preserve"> </w:t>
+      </w:r>
+      <w:r>
+        <w:rPr>
+          <w:rStyle w:val="VerbatimChar"/>
+        </w:rPr>
+        <w:t xml:space="preserve">tcga_RSEM_gene_tpm</w:t>
+      </w:r>
+      <w:r>
+        <w:t xml:space="preserve"> </w:t>
+      </w:r>
+      <w:r>
+        <w:t xml:space="preserve">via Xena.</w:t>
       </w:r>
       <w:r>
         <w:br/>
@@ -1951,7 +2032,19 @@
         </w:numPr>
       </w:pPr>
       <w:r>
-        <w:t xml:space="preserve">Hugo et al., Cell 2016, GEO GSE78220.</w:t>
+        <w:t xml:space="preserve">Mariathasan et al., IMvigor210 (</w:t>
+      </w:r>
+      <w:r>
+        <w:rPr>
+          <w:rStyle w:val="VerbatimChar"/>
+        </w:rPr>
+        <w:t xml:space="preserve">IMvigor210CoreBiologies</w:t>
+      </w:r>
+      <w:r>
+        <w:t xml:space="preserve"> </w:t>
+      </w:r>
+      <w:r>
+        <w:t xml:space="preserve">1.0.1).</w:t>
       </w:r>
       <w:r>
         <w:br/>
@@ -1966,11 +2059,26 @@
         </w:numPr>
       </w:pPr>
       <w:r>
+        <w:t xml:space="preserve">Hugo et al., Cell 2016, GEO GSE78220.</w:t>
+      </w:r>
+      <w:r>
+        <w:br/>
+      </w:r>
+    </w:p>
+    <w:p>
+      <w:pPr>
+        <w:pStyle w:val="Compact"/>
+        <w:numPr>
+          <w:ilvl w:val="0"/>
+          <w:numId w:val="1001"/>
+        </w:numPr>
+      </w:pPr>
+      <w:r>
         <w:t xml:space="preserve">Riaz et al., Cell 2017, GEO GSE91061.</w:t>
       </w:r>
     </w:p>
-    <w:bookmarkEnd w:id="40"/>
-    <w:bookmarkEnd w:id="41"/>
+    <w:bookmarkEnd w:id="42"/>
+    <w:bookmarkEnd w:id="43"/>
     <w:sectPr>
       <w:footnotePr>
         <w:numRestart w:val="eachSect"/>

</xml_diff>